<commit_message>
Add native Quarto listing styles and examples
</commit_message>
<xml_diff>
--- a/academic/_extensions/academic/academic.docx
+++ b/academic/_extensions/academic/academic.docx
@@ -1298,8 +1298,8 @@
     <w:name w:val="Verbatim Char"/>
     <w:basedOn w:val="BodyTextChar"/>
     <w:rPr>
-      <w:rFonts w:ascii="Consolas" w:hAnsi="Consolas"/>
-      <w:sz w:val="22"/>
+      <w:rFonts w:ascii="Courier New" w:hAnsi="Courier New" w:eastAsia="Courier New" w:cs="Courier New"/>
+      <w:sz w:val="24"/>
     </w:rPr>
   </w:style>
   <w:style w:customStyle="1" w:styleId="SectionNumber" w:type="character">
@@ -1479,7 +1479,11 @@
     <w:basedOn w:val="Normal"/>
     <w:link w:val="VerbatimChar"/>
     <w:pPr>
-      <w:wordWrap w:val="off"/>
+      <w:keepNext w:val="0"/>
+      <w:keepLines w:val="0"/>
+      <w:spacing w:line="240" w:lineRule="auto" w:before="0" w:after="120"/>
+      <w:ind w:left="0" w:right="0" w:firstLine="0"/>
+      <w:jc w:val="left"/>
     </w:pPr>
   </w:style>
   <w:style w:customStyle="1" w:styleId="KeywordTok" w:type="character">
@@ -1487,6 +1491,7 @@
     <w:basedOn w:val="VerbatimChar"/>
     <w:rPr>
       <w:b/>
+      <w:i/>
       <w:color w:val="007020"/>
     </w:rPr>
   </w:style>
@@ -1565,6 +1570,7 @@
     <w:basedOn w:val="VerbatimChar"/>
     <w:rPr>
       <w:b/>
+      <w:i/>
       <w:color w:val="008000"/>
     </w:rPr>
   </w:style>
@@ -1628,6 +1634,7 @@
     <w:basedOn w:val="VerbatimChar"/>
     <w:rPr>
       <w:b/>
+      <w:i/>
       <w:color w:val="007020"/>
     </w:rPr>
   </w:style>

</xml_diff>